<commit_message>
feat: add external Word upload mode for proposals
</commit_message>
<xml_diff>
--- a/doc_templates/proposta_template.docx
+++ b/doc_templates/proposta_template.docx
@@ -1,6 +1,6 @@
 
 <file path=word/document.xml><?xml version="1.0" encoding="utf-8"?>
-<w:document xmlns:wpc="http://schemas.microsoft.com/office/word/2010/wordprocessingCanvas" xmlns:cx="http://schemas.microsoft.com/office/drawing/2014/chartex" xmlns:cx1="http://schemas.microsoft.com/office/drawing/2015/9/8/chartex" xmlns:cx2="http://schemas.microsoft.com/office/drawing/2015/10/21/chartex" xmlns:cx3="http://schemas.microsoft.com/office/drawing/2016/5/9/chartex" xmlns:cx4="http://schemas.microsoft.com/office/drawing/2016/5/10/chartex" xmlns:cx5="http://schemas.microsoft.com/office/drawing/2016/5/11/chartex" xmlns:cx6="http://schemas.microsoft.com/office/drawing/2016/5/12/chartex" xmlns:cx7="http://schemas.microsoft.com/office/drawing/2016/5/13/chartex" xmlns:cx8="http://schemas.microsoft.com/office/drawing/2016/5/14/chartex" xmlns:mc="http://schemas.openxmlformats.org/markup-compatibility/2006" xmlns:aink="http://schemas.microsoft.com/office/drawing/2016/ink" xmlns:am3d="http://schemas.microsoft.com/office/drawing/2017/model3d" xmlns:o="urn:schemas-microsoft-com:office:office" xmlns:oel="http://schemas.microsoft.com/office/2019/extlst" xmlns:r="http://schemas.openxmlformats.org/officeDocument/2006/relationships" xmlns:m="http://schemas.openxmlformats.org/officeDocument/2006/math" xmlns:v="urn:schemas-microsoft-com:vml" xmlns:wp14="http://schemas.microsoft.com/office/word/2010/wordprocessingDrawing" xmlns:wp="http://schemas.openxmlformats.org/drawingml/2006/wordprocessingDrawing" xmlns:w10="urn:schemas-microsoft-com:office:word" xmlns:w="http://schemas.openxmlformats.org/wordprocessingml/2006/main" xmlns:w14="http://schemas.microsoft.com/office/word/2010/wordml" xmlns:w15="http://schemas.microsoft.com/office/word/2012/wordml" xmlns:w16cex="http://schemas.microsoft.com/office/word/2018/wordml/cex" xmlns:w16cid="http://schemas.microsoft.com/office/word/2016/wordml/cid" xmlns:w16="http://schemas.microsoft.com/office/word/2018/wordml" xmlns:w16sdtdh="http://schemas.microsoft.com/office/word/2020/wordml/sdtdatahash" xmlns:w16se="http://schemas.microsoft.com/office/word/2015/wordml/symex" xmlns:wpg="http://schemas.microsoft.com/office/word/2010/wordprocessingGroup" xmlns:wpi="http://schemas.microsoft.com/office/word/2010/wordprocessingInk" xmlns:wne="http://schemas.microsoft.com/office/word/2006/wordml" xmlns:wps="http://schemas.microsoft.com/office/word/2010/wordprocessingShape" mc:Ignorable="w14 w15 w16se w16cid w16 w16cex w16sdtdh wp14">
+<w:document xmlns:a="http://schemas.openxmlformats.org/drawingml/2006/main" xmlns:mc="http://schemas.openxmlformats.org/markup-compatibility/2006" xmlns:o="urn:schemas-microsoft-com:office:office" xmlns:pic="http://schemas.openxmlformats.org/drawingml/2006/picture" xmlns:r="http://schemas.openxmlformats.org/officeDocument/2006/relationships" xmlns:v="urn:schemas-microsoft-com:vml" xmlns:w="http://schemas.openxmlformats.org/wordprocessingml/2006/main" xmlns:w10="urn:schemas-microsoft-com:office:word" xmlns:w14="http://schemas.microsoft.com/office/word/2010/wordml" xmlns:wp="http://schemas.openxmlformats.org/drawingml/2006/wordprocessingDrawing" xmlns:wp14="http://schemas.microsoft.com/office/word/2010/wordprocessingDrawing" xmlns:wps="http://schemas.microsoft.com/office/word/2010/wordprocessingShape" mc:Ignorable="w14 w15 w16se w16cid w16 w16cex w16sdtdh wp14">
   <w:body>
     <w:p>
       <w:pPr>
@@ -146,11 +146,11 @@
             <wp:wrapTopAndBottom/>
             <wp:docPr id="7" name="Image 7"/>
             <wp:cNvGraphicFramePr>
-              <a:graphicFrameLocks xmlns:a="http://schemas.openxmlformats.org/drawingml/2006/main"/>
+              <a:graphicFrameLocks/>
             </wp:cNvGraphicFramePr>
-            <a:graphic xmlns:a="http://schemas.openxmlformats.org/drawingml/2006/main">
+            <a:graphic>
               <a:graphicData uri="http://schemas.openxmlformats.org/drawingml/2006/picture">
-                <pic:pic xmlns:pic="http://schemas.openxmlformats.org/drawingml/2006/picture">
+                <pic:pic>
                   <pic:nvPicPr>
                     <pic:cNvPr id="7" name="Image 7"/>
                     <pic:cNvPicPr/>
@@ -240,9 +240,9 @@
                 <wp:wrapTopAndBottom/>
                 <wp:docPr id="8" name="Textbox 8"/>
                 <wp:cNvGraphicFramePr>
-                  <a:graphicFrameLocks xmlns:a="http://schemas.openxmlformats.org/drawingml/2006/main"/>
+                  <a:graphicFrameLocks/>
                 </wp:cNvGraphicFramePr>
-                <a:graphic xmlns:a="http://schemas.openxmlformats.org/drawingml/2006/main">
+                <a:graphic>
                   <a:graphicData uri="http://schemas.microsoft.com/office/word/2010/wordprocessingShape">
                     <wps:wsp>
                       <wps:cNvSpPr txBox="1">
@@ -483,9 +483,9 @@
                 <wp:wrapTopAndBottom/>
                 <wp:docPr id="9" name="Textbox 9"/>
                 <wp:cNvGraphicFramePr>
-                  <a:graphicFrameLocks xmlns:a="http://schemas.openxmlformats.org/drawingml/2006/main"/>
+                  <a:graphicFrameLocks/>
                 </wp:cNvGraphicFramePr>
-                <a:graphic xmlns:a="http://schemas.openxmlformats.org/drawingml/2006/main">
+                <a:graphic>
                   <a:graphicData uri="http://schemas.microsoft.com/office/word/2010/wordprocessingShape">
                     <wps:wsp>
                       <wps:cNvSpPr txBox="1">
@@ -655,9 +655,9 @@
                 <wp:wrapTopAndBottom/>
                 <wp:docPr id="10" name="Textbox 10"/>
                 <wp:cNvGraphicFramePr>
-                  <a:graphicFrameLocks xmlns:a="http://schemas.openxmlformats.org/drawingml/2006/main"/>
+                  <a:graphicFrameLocks/>
                 </wp:cNvGraphicFramePr>
-                <a:graphic xmlns:a="http://schemas.openxmlformats.org/drawingml/2006/main">
+                <a:graphic>
                   <a:graphicData uri="http://schemas.microsoft.com/office/word/2010/wordprocessingShape">
                     <wps:wsp>
                       <wps:cNvSpPr txBox="1">
@@ -844,9 +844,9 @@
                 <wp:wrapTopAndBottom/>
                 <wp:docPr id="11" name="Textbox 11"/>
                 <wp:cNvGraphicFramePr>
-                  <a:graphicFrameLocks xmlns:a="http://schemas.openxmlformats.org/drawingml/2006/main"/>
+                  <a:graphicFrameLocks/>
                 </wp:cNvGraphicFramePr>
-                <a:graphic xmlns:a="http://schemas.openxmlformats.org/drawingml/2006/main">
+                <a:graphic>
                   <a:graphicData uri="http://schemas.microsoft.com/office/word/2010/wordprocessingShape">
                     <wps:wsp>
                       <wps:cNvSpPr txBox="1">
@@ -3440,9 +3440,9 @@
                 <wp:wrapNone/>
                 <wp:docPr id="12" name="Graphic 12"/>
                 <wp:cNvGraphicFramePr>
-                  <a:graphicFrameLocks xmlns:a="http://schemas.openxmlformats.org/drawingml/2006/main"/>
+                  <a:graphicFrameLocks/>
                 </wp:cNvGraphicFramePr>
-                <a:graphic xmlns:a="http://schemas.openxmlformats.org/drawingml/2006/main">
+                <a:graphic>
                   <a:graphicData uri="http://schemas.microsoft.com/office/word/2010/wordprocessingShape">
                     <wps:wsp>
                       <wps:cNvSpPr>
@@ -5405,14 +5405,22 @@
                 <w:b/>
               </w:rPr>
             </w:pPr>
-            <w:r>
-              <w:rPr>
-                <w:b/>
-                <w:color w:val="3D3D3D"/>
-                <w:spacing w:val="-2"/>
-              </w:rPr>
-              <w:t>{{VALOR_TOTAL}}</w:t>
-            </w:r>
+            <w:sdt>
+              <w:sdtPr>
+                <w:alias w:val="Valor total AD"/>
+                <w:tag w:val="AD_VALOR_TOTAL"/>
+              </w:sdtPr>
+              <w:sdtContent>
+                <w:r>
+                  <w:rPr>
+                    <w:b/>
+                    <w:color w:val="3D3D3D"/>
+                    <w:spacing w:val="-2"/>
+                  </w:rPr>
+                  <w:t>{{VALOR_TOTAL}}</w:t>
+                </w:r>
+              </w:sdtContent>
+            </w:sdt>
           </w:p>
         </w:tc>
       </w:tr>
@@ -11660,9 +11668,9 @@
                 <wp:wrapTopAndBottom/>
                 <wp:docPr id="13" name="Graphic 13"/>
                 <wp:cNvGraphicFramePr>
-                  <a:graphicFrameLocks xmlns:a="http://schemas.openxmlformats.org/drawingml/2006/main"/>
+                  <a:graphicFrameLocks/>
                 </wp:cNvGraphicFramePr>
-                <a:graphic xmlns:a="http://schemas.openxmlformats.org/drawingml/2006/main">
+                <a:graphic>
                   <a:graphicData uri="http://schemas.microsoft.com/office/word/2010/wordprocessingShape">
                     <wps:wsp>
                       <wps:cNvSpPr>
@@ -11740,9 +11748,9 @@
                 <wp:wrapTopAndBottom/>
                 <wp:docPr id="14" name="Graphic 14"/>
                 <wp:cNvGraphicFramePr>
-                  <a:graphicFrameLocks xmlns:a="http://schemas.openxmlformats.org/drawingml/2006/main"/>
+                  <a:graphicFrameLocks/>
                 </wp:cNvGraphicFramePr>
-                <a:graphic xmlns:a="http://schemas.openxmlformats.org/drawingml/2006/main">
+                <a:graphic>
                   <a:graphicData uri="http://schemas.microsoft.com/office/word/2010/wordprocessingShape">
                     <wps:wsp>
                       <wps:cNvSpPr>
@@ -12222,11 +12230,11 @@
                   <wp:effectExtent l="0" t="0" r="0" b="0"/>
                   <wp:docPr id="15" name="Image 15" descr="P279C2T2#yIS1"/>
                   <wp:cNvGraphicFramePr>
-                    <a:graphicFrameLocks xmlns:a="http://schemas.openxmlformats.org/drawingml/2006/main"/>
+                    <a:graphicFrameLocks/>
                   </wp:cNvGraphicFramePr>
-                  <a:graphic xmlns:a="http://schemas.openxmlformats.org/drawingml/2006/main">
+                  <a:graphic>
                     <a:graphicData uri="http://schemas.openxmlformats.org/drawingml/2006/picture">
-                      <pic:pic xmlns:pic="http://schemas.openxmlformats.org/drawingml/2006/picture">
+                      <pic:pic>
                         <pic:nvPicPr>
                           <pic:cNvPr id="15" name="Image 15" descr="P279C2T2#yIS1"/>
                           <pic:cNvPicPr/>
@@ -12279,11 +12287,11 @@
                   <wp:effectExtent l="0" t="0" r="0" b="0"/>
                   <wp:docPr id="16" name="Image 16"/>
                   <wp:cNvGraphicFramePr>
-                    <a:graphicFrameLocks xmlns:a="http://schemas.openxmlformats.org/drawingml/2006/main"/>
+                    <a:graphicFrameLocks/>
                   </wp:cNvGraphicFramePr>
-                  <a:graphic xmlns:a="http://schemas.openxmlformats.org/drawingml/2006/main">
+                  <a:graphic>
                     <a:graphicData uri="http://schemas.openxmlformats.org/drawingml/2006/picture">
-                      <pic:pic xmlns:pic="http://schemas.openxmlformats.org/drawingml/2006/picture">
+                      <pic:pic>
                         <pic:nvPicPr>
                           <pic:cNvPr id="16" name="Image 16"/>
                           <pic:cNvPicPr/>
@@ -12896,11 +12904,11 @@
                   <wp:effectExtent l="0" t="0" r="0" b="0"/>
                   <wp:docPr id="17" name="Image 17" descr="P285C5T2#yIS1"/>
                   <wp:cNvGraphicFramePr>
-                    <a:graphicFrameLocks xmlns:a="http://schemas.openxmlformats.org/drawingml/2006/main"/>
+                    <a:graphicFrameLocks/>
                   </wp:cNvGraphicFramePr>
-                  <a:graphic xmlns:a="http://schemas.openxmlformats.org/drawingml/2006/main">
+                  <a:graphic>
                     <a:graphicData uri="http://schemas.openxmlformats.org/drawingml/2006/picture">
-                      <pic:pic xmlns:pic="http://schemas.openxmlformats.org/drawingml/2006/picture">
+                      <pic:pic>
                         <pic:nvPicPr>
                           <pic:cNvPr id="17" name="Image 17" descr="P285C5T2#yIS1"/>
                           <pic:cNvPicPr/>

</xml_diff>